<commit_message>
Cut main text to the journal's 3,000-word limit
The authors confirmed the Insights into Imaging Original Article limit:
3,000 words of main text, excluding references and figure/table legends, with
no separate abstract word limit currently stated.

Main text goes from 3,259 to 2,998 words. Every cut removes detail that the
Online Resources already carry - the GEE and timing specifications in Methods,
the algorithm validation narrative, the paired-subgroup description, and
repetition between Results and Discussion. No reviewer-responsive content was
removed; a content check confirms all key figures survive, including the 0/119
D3 finding, the 59/59 vs 6/60 whirlpool contrast, the era mediation (2.27 to
1.56 with examination-type 3.46), the pathway-position evidence, the algorithm
agreement statistics, and the complete-separation disclosure.

The abstract stays at 275 words, per the authors' instruction not to truncate
it to an unstated limit.
</commit_message>
<xml_diff>
--- a/投稿说明_InsightsIntoImaging_中文.docx
+++ b/投稿说明_InsightsIntoImaging_中文.docx
@@ -258,7 +258,49 @@
         <w:pStyle w:val="Heading1"/>
       </w:pPr>
       <w:r>
-        <w:t>三、必须你来确认的一件事（重要）</w:t>
+        <w:t>三、字数已按官方上限定稿</w:t>
+      </w:r>
+    </w:p>
+    <w:p>
+      <w:pPr>
+        <w:spacing w:after="160"/>
+      </w:pPr>
+      <w:r>
+        <w:t xml:space="preserve">已确认 </w:t>
+      </w:r>
+      <w:r>
+        <w:rPr>
+          <w:b/>
+        </w:rPr>
+        <w:t>Original Article 正文上限 3,000 词</w:t>
+      </w:r>
+      <w:r>
+        <w:t xml:space="preserve">（不含参考文献与图表图例）。正文现为 </w:t>
+      </w:r>
+      <w:r>
+        <w:rPr>
+          <w:b/>
+        </w:rPr>
+        <w:t>2,998 词</w:t>
+      </w:r>
+      <w:r>
+        <w:t>，卡在上限内。</w:t>
+      </w:r>
+    </w:p>
+    <w:p>
+      <w:pPr>
+        <w:spacing w:after="160"/>
+      </w:pPr>
+      <w:r>
+        <w:t>从 3,259 词删到 2,998 词，删的全部是附录里已有的重复细节，没有删任何一条回应评审意见的实质内容。核对过的关键数据全部保留：0/119 未记录 D3、SMA-SMV 8.4%、漩涡征 59/59 与 6/60、三模态检出 78.7%／53.4%／54.6%、年代 OR 2.27→1.56 与检查类型 OR 3.46、造影末位检查 75.1% 与 80.4% vs 70.5%、配对亚组 96.6% 扭转、算法一致性 92%／kappa 0.83、完全分离导致模型不收敛、STROBE 与不适用 STARD 的声明。</w:t>
+      </w:r>
+    </w:p>
+    <w:p>
+      <w:pPr>
+        <w:spacing w:after="160"/>
+      </w:pPr>
+      <w:r>
+        <w:t>摘要保持 275 词未动 —— 官网当前只要求四段式结构、未单列字数上限，因此不做硬性截断。</w:t>
       </w:r>
     </w:p>
     <w:p>
@@ -269,27 +311,18 @@
         <w:rPr>
           <w:b/>
         </w:rPr>
-        <w:t>IiI 的 Original Article 正文字数上限，我没能核实到确切数字</w:t>
+        <w:t>一个需要留意的口径问题</w:t>
       </w:r>
       <w:r>
-        <w:t xml:space="preserve"> —— 本运行环境的网络策略把 journals.myesr.org、insightsimaging.springeropen.com、i3-journal.org 三个站点都挡住了，只能从搜索摘要确认到"摘要必须四段式""必须有 Key Points""字数只算正文""</w:t>
-      </w:r>
-      <w:r>
-        <w:rPr>
-          <w:b/>
-        </w:rPr>
-        <w:t>超限直接退回不送审</w:t>
-      </w:r>
-      <w:r>
-        <w:t>"。</w:t>
+        <w:t>：官方表述是"正文，不含参考文献和图表图例"，没有明说摘要是否计入。按中文"正文"的通常含义和该刊英文原文（word count excluding abstract, figure/table legends, references）判断，摘要不计入，所以 2,998 是安全的。但如果投稿系统的字数校验把摘要也算进去（2,998 + 275 = 3,273，会超），告诉我一声，我可以把"选择性亚组"整段和 Discussion 第四段整体移入附录，十分钟内再削约 250 词。</w:t>
       </w:r>
     </w:p>
     <w:p>
       <w:pPr>
-        <w:spacing w:after="160"/>
+        <w:pStyle w:val="Heading1"/>
       </w:pPr>
       <w:r>
-        <w:t>请打开投稿须知里的 `INSI_Manuscript-requirements` PDF 核对以下四项，然后按情况处理：</w:t>
+        <w:t>三之二、其他已确认并已执行的格式要求</w:t>
       </w:r>
     </w:p>
     <w:p>
@@ -303,10 +336,10 @@
         <w:rPr>
           <w:b/>
         </w:rPr>
-        <w:t>正文上限</w:t>
+        <w:t>Key Points 每条不超过约 12 词</w:t>
       </w:r>
       <w:r>
-        <w:t>：若为 4,000 词，现稿 3,259 词有富余，可把上面移入附录的配对亚组分析搬回正文；若为 3,000 词，还需再删约 260 词 —— 建议删 Results 中"The three modalities were used in different children"那一段的检查顺序细节（约 90 词）和 Discussion 第 4 段后半（约 90 词），再把 Limitations 第二段末句删掉（约 80 词），都不影响任何证据链。</w:t>
+        <w:t xml:space="preserve"> —— 原三条为 15–16 词，已重写为各 10 词，且未复用摘要或正文的任何句子（该刊明文禁止照抄）。</w:t>
       </w:r>
     </w:p>
     <w:p>
@@ -320,10 +353,10 @@
         <w:rPr>
           <w:b/>
         </w:rPr>
-        <w:t>摘要上限</w:t>
+        <w:t>图题 ≤15 词、图注 ≤300 词，且必须放在正文而非图片文件内</w:t>
       </w:r>
       <w:r>
-        <w:t>：现为 275 词。若上限 250，删 Results 段中"Detection was 78.7%…on non-comparable denominators"一句即可（该数据在正文表 2 中完整呈现）。</w:t>
+        <w:t xml:space="preserve"> —— 已改为"粗体短标题 + 图注"结构（标题 9–12 词、图注 49–55 词），分图用 a／b 标注；附录 Fig. S1 同步。</w:t>
       </w:r>
     </w:p>
     <w:p>
@@ -331,33 +364,7 @@
         <w:spacing w:after="160"/>
       </w:pPr>
       <w:r>
-        <w:t xml:space="preserve">• </w:t>
-      </w:r>
-      <w:r>
-        <w:rPr>
-          <w:b/>
-        </w:rPr>
-        <w:t>Key Points 条数</w:t>
-      </w:r>
-      <w:r>
-        <w:t>：现为 3 条。若要求 3 条以内即符合；若允许更多可再加。</w:t>
-      </w:r>
-    </w:p>
-    <w:p>
-      <w:pPr>
-        <w:spacing w:after="160"/>
-      </w:pPr>
-      <w:r>
-        <w:t xml:space="preserve">• </w:t>
-      </w:r>
-      <w:r>
-        <w:rPr>
-          <w:b/>
-        </w:rPr>
-        <w:t>图表数量上限</w:t>
-      </w:r>
-      <w:r>
-        <w:t>：现为 4 表 3 图。若上限是 8 项以内，符合。</w:t>
+        <w:t>• 图表数量：正文 4 表 3 图。同刊 Educational Review 的配额是 5 表 12 图，Original Article 不太可能比这更紧，故无需削减。</w:t>
       </w:r>
     </w:p>
     <w:p>

</xml_diff>

<commit_message>
Name Jun Yang as the blinded adjudicator in author contributions
Added "JY performed the blinded adjudication of the report labels." to the
contributions statement, between data acquisition and analysis. The rest
of the assignment is unchanged at the authors' instruction.

Consistent with the Methods, which state the adjudicator was a paediatric
surgeon: JY is in General Surgery.

Flagged in cn2.md, not changed: the statement now shows JY designed the
study, adjudicated, and supervised it. The blinding claimed in the Methods
is to operative findings, which holds, but the adjudicator is a senior
author from the operating department. A one-sentence Limitations addition
is drafted there for the authors to accept or decline.

Co-Authored-By: Claude Opus 5 <noreply@anthropic.com>
Claude-Session: https://claude.ai/code/session_013TkounLTBFVQRstE3VnhkM
</commit_message>
<xml_diff>
--- a/投稿说明_InsightsIntoImaging_中文.docx
+++ b/投稿说明_InsightsIntoImaging_中文.docx
@@ -4302,6 +4302,134 @@
       </w:r>
       <w:r>
         <w:t>：其余八位作者的 ORCID 我没有，标题页只列了 Jun Shu 与 Jun Yang 两个。IiI 只强制要求通讯作者的 ORCID，其余非必填，但在 Editorial Manager 里逐位补填对作者本人有好处。</w:t>
+      </w:r>
+    </w:p>
+    <w:p>
+      <w:pPr>
+        <w:pStyle w:val="Heading1"/>
+      </w:pPr>
+      <w:r>
+        <w:t>二十六、盲审复阅者已确认为 Jun Yang（已完成）</w:t>
+      </w:r>
+    </w:p>
+    <w:p>
+      <w:pPr>
+        <w:spacing w:after="160"/>
+      </w:pPr>
+      <w:r>
+        <w:t>作者贡献声明中已加入一句：</w:t>
+      </w:r>
+      <w:r>
+        <w:rPr>
+          <w:b/>
+        </w:rPr>
+        <w:t>`JY performed the blinded adjudication of the report labels.`</w:t>
+      </w:r>
+      <w:r>
+        <w:t xml:space="preserve"> 位置在数据采集与数据分析之间。其余贡献分配按你的意见保持不变。</w:t>
+      </w:r>
+    </w:p>
+    <w:p>
+      <w:pPr>
+        <w:spacing w:after="160"/>
+      </w:pPr>
+      <w:r>
+        <w:t xml:space="preserve">与正文一致性已核：正文 Methods 写「A </w:t>
+      </w:r>
+      <w:r>
+        <w:rPr>
+          <w:b/>
+        </w:rPr>
+        <w:t>paediatric surgeon</w:t>
+      </w:r>
+      <w:r>
+        <w:t xml:space="preserve"> blinded to the operative findings adjudicated 32 reports」，JY 为普外科医师，与此相符，不矛盾。</w:t>
+      </w:r>
+    </w:p>
+    <w:p>
+      <w:pPr>
+        <w:spacing w:after="160"/>
+      </w:pPr>
+      <w:r>
+        <w:rPr>
+          <w:b/>
+        </w:rPr>
+        <w:t>⚠️ 有一点你要心里有数，审稿人可能会问。</w:t>
+      </w:r>
+      <w:r>
+        <w:t xml:space="preserve"> 现在贡献声明写明：JY 既</w:t>
+      </w:r>
+      <w:r>
+        <w:rPr>
+          <w:b/>
+        </w:rPr>
+        <w:t>设计了研究</w:t>
+      </w:r>
+      <w:r>
+        <w:t>、又</w:t>
+      </w:r>
+      <w:r>
+        <w:rPr>
+          <w:b/>
+        </w:rPr>
+        <w:t>做了盲法复阅</w:t>
+      </w:r>
+      <w:r>
+        <w:t>、还</w:t>
+      </w:r>
+      <w:r>
+        <w:rPr>
+          <w:b/>
+        </w:rPr>
+        <w:t>指导了全文</w:t>
+      </w:r>
+      <w:r>
+        <w:t>。正文声称的盲法是「对</w:t>
+      </w:r>
+      <w:r>
+        <w:rPr>
+          <w:b/>
+        </w:rPr>
+        <w:t>手术所见</w:t>
+      </w:r>
+      <w:r>
+        <w:t>设盲」——这一点技术上成立（复阅时只看报告文本、不看手术记录），但复阅者同时是提出研究假设的资深作者，且来自实施手术的同一科室，如果 JY 本人参与过其中部分患儿的手术，对个别病例可能存在回忆偏倚。</w:t>
+      </w:r>
+    </w:p>
+    <w:p>
+      <w:pPr>
+        <w:spacing w:after="160"/>
+      </w:pPr>
+      <w:r>
+        <w:t>正文 Methods 已有「With a single adjudicator, interobserver agreement could not be estimated」这句限制。</w:t>
+      </w:r>
+      <w:r>
+        <w:rPr>
+          <w:b/>
+        </w:rPr>
+        <w:t>如果你希望把这一层也写明，我可以在 Limitations 里加一句</w:t>
+      </w:r>
+      <w:r>
+        <w:t>（约 20 词，需从别处等量削减以守住 3,000 词）：</w:t>
+      </w:r>
+    </w:p>
+    <w:p>
+      <w:pPr>
+        <w:spacing w:after="160"/>
+      </w:pPr>
+      <w:r>
+        <w:rPr>
+          <w:i/>
+        </w:rPr>
+        <w:t>"The adjudicator was a study author from the operating department, blinded to operative findings but not independent of the study."</w:t>
+      </w:r>
+    </w:p>
+    <w:p>
+      <w:pPr>
+        <w:spacing w:after="160"/>
+      </w:pPr>
+      <w:r>
+        <w:t>加不加由你定。不加也说得过去——盲法的对象（手术所见）已在 Methods 写明，单一复阅者的局限也已声明。</w:t>
       </w:r>
     </w:p>
     <w:sectPr>

</xml_diff>

<commit_message>
Cut Keywords from 6 to the portal's 5-keyword limit
A screenshot showed Editorial Manager's Keyword Count at 6 against a limit
of 5. Dropped "Quality improvement": it was the most generic and most
substitutable of the six, and what it signals is already carried by
"Radiology report" in context (the paper's novelty is auditing report
content, not diagnostic accuracy). The other five are each load-bearing --
Intestinal malrotation, Intestinal volvulus and Ultrasonography name the
core subject, Infant, Newborn flags that most of the cohort is neonatal,
and Radiology report signals the report-audit angle the paper argues for.

Confirmed no other reference to "Quality improvement" survives in the
repository, the manuscript and submission sheet keyword lines match
verbatim, and document properties stay empty.

Co-Authored-By: Claude Sonnet 5 <noreply@anthropic.com>
Claude-Session: https://claude.ai/code/session_013TkounLTBFVQRstE3VnhkM
</commit_message>
<xml_diff>
--- a/投稿说明_InsightsIntoImaging_中文.docx
+++ b/投稿说明_InsightsIntoImaging_中文.docx
@@ -6555,6 +6555,44 @@
       </w:pPr>
       <w:r>
         <w:t>操作单第 47 行、第二项核对清单都已同步这个 245 词的数字和"只贴四段"的提醒。</w:t>
+      </w:r>
+    </w:p>
+    <w:p>
+      <w:pPr>
+        <w:pStyle w:val="Heading1"/>
+      </w:pPr>
+      <w:r>
+        <w:t>关键词超限（6/5），删了 Quality improvement</w:t>
+      </w:r>
+    </w:p>
+    <w:p>
+      <w:pPr>
+        <w:spacing w:after="160"/>
+      </w:pPr>
+      <w:r>
+        <w:t>系统限 5 个，正文原有 6 个：Intestinal malrotation; Intestinal volvulus; Infant, Newborn; Ultrasonography; Radiology report; Quality improvement。这处上限我之前设置时没有查证具体数字，是我的疏漏。</w:t>
+      </w:r>
+    </w:p>
+    <w:p>
+      <w:pPr>
+        <w:spacing w:after="160"/>
+      </w:pPr>
+      <w:r>
+        <w:rPr>
+          <w:b/>
+        </w:rPr>
+        <w:t>删的是 Quality improvement，其余五个都保留。</w:t>
+      </w:r>
+      <w:r>
+        <w:t xml:space="preserve"> 理由：Intestinal malrotation / Intestinal volvulus / Ultrasonography 是核心主题词，删了等于让人搜不到这篇论文；Infant, Newborn 对应全文近三分之二病例是新生儿这个关键人群特征；Radiology report 是这篇论文区别于一般诊断准确性研究的核心角度——审计的是报告内容而非影像本身。Quality improvement 是六个里最通用、最可被其他词覆盖的一个：它想表达的"这是一篇质量审计文章"，Radiology report 已经在语境里隐含了，删掉它损失的检索价值最小。</w:t>
+      </w:r>
+    </w:p>
+    <w:p>
+      <w:pPr>
+        <w:spacing w:after="160"/>
+      </w:pPr>
+      <w:r>
+        <w:t>正文 Keywords 行、操作单里对应的表单字段已同步改成五个，两处逐字一致。检索过全仓库，Quality improvement 这个词没有在别处被引用，删得干净。</w:t>
       </w:r>
     </w:p>
     <w:sectPr>

</xml_diff>